<commit_message>
Fix paper errors and README inaccuracies
Paper:
- §3.1: correct API from "Twitter/X API v2 full-archive search" to twitterapi.io
- §4.4: fix event count (eight → six) and event list (military incursion → COVID
  Emergency, which is what Figure 1 actually shows)

README:
- Corpus table: correct accounts (@Gobierno_SV, @FGR_SV, not @MH_SV, @PolicíaSV)
- Step 1 table: correct twitter collector API description to twitterapi.io

Co-Authored-By: Claude Sonnet 4.6 <noreply@anthropic.com>
</commit_message>
<xml_diff>
--- a/paper/governing_through_narrative.docx
+++ b/paper/governing_through_narrative.docx
@@ -478,7 +478,7 @@
           <w:i w:val="0"/>
           <w:sz w:val="24"/>
         </w:rPr>
-        <w:t>The primary data on government communications consist of 161,788 tweets collected from five official Salvadoran government accounts via the Twitter/X API v2 full-archive search endpoint: @AsambleaSV (54,466 tweets; the Asamblea Legislativa), @FGR_SV (36,519; the Fiscalía General de la República), @Gobierno_SV (33,370; Gobierno de El Salvador), @PresidenciaSV (30,438; Casa Presidencial), and @nayibbukele (6,995; Nayib Bukele’s personal account). Collection was conducted in February–March 2026, paginating through the full available timeline for each account. The corpus spans 2015–2026, though coverage before 2018 is thinner for accounts created later.</w:t>
+        <w:t>The primary data on government communications consist of 161,788 tweets collected from five official Salvadoran government accounts via the twitterapi.io full-archive search API: @AsambleaSV (54,466 tweets; the Asamblea Legislativa), @FGR_SV (36,519; the Fiscalía General de la República), @Gobierno_SV (33,370; Gobierno de El Salvador), @PresidenciaSV (30,438; Casa Presidencial), and @nayibbukele (6,995; Nayib Bukele’s personal account). Collection was conducted in February–March 2026, paginating through the full available timeline for each account. The corpus spans 2015–2026, though coverage before 2018 is thinner for accounts created later.</w:t>
       </w:r>
     </w:p>
     <w:p>
@@ -743,7 +743,7 @@
           <w:i w:val="0"/>
           <w:sz w:val="24"/>
         </w:rPr>
-        <w:t>To compare government and media framing of key events, we construct text windows of plus or minus 30 days around eight politically significant dates. Within each window, we build separate term-frequency vectors for government tweets and media articles, weight by TF-IDF, and visualize the most distinctive terms using word clouds. Events examined include Bukele’s inauguration (June 2019), the military incursion into the legislature (February 2020), the May 2021 institutional takeover, the Bitcoin legal tender law (September 2021), the declaration of the Estado de Excepción (March 2022), and the opening of CECOT (2023).</w:t>
+        <w:t>To compare government and media framing of key events, we construct text windows of plus or minus 30 days around six politically significant dates. Within each window, we build separate term-frequency vectors for government tweets and media articles, weight by TF-IDF, and visualize the most distinctive terms using word clouds. Events examined include Bukele’s inauguration (June 2019), the COVID Emergency declaration (March 2020), the May 2021 institutional takeover, the Bitcoin legal tender law (September 2021), the declaration of the Estado de Excepción (March 2022), and the opening of CECOT (2023).</w:t>
       </w:r>
     </w:p>
     <w:p>

</xml_diff>

<commit_message>
Strengthen §6 confound discussion; fix HuggingFace citation
- §6 limitations: replace vague 'broader political context shifts' with three
  specific simultaneous confounds (personnel replacement, new supermajority,
  post-COVID/Bitcoin agenda shift); add the internal comparison argument
  (@Gobierno_SV and @PresidenciaSV as partial control) to give the finding
  more causal traction without overclaiming
- Citation: Justinian336 → Martinez, J. (2023), salvadoran-news, with correct
  dataset URL (huggingface.co/datasets/justinian336/salvadoran-news)

Co-Authored-By: Claude Sonnet 4.6 <noreply@anthropic.com>
</commit_message>
<xml_diff>
--- a/paper/governing_through_narrative.docx
+++ b/paper/governing_through_narrative.docx
@@ -525,7 +525,7 @@
           <w:i w:val="0"/>
           <w:sz w:val="24"/>
         </w:rPr>
-        <w:t>The news article corpus comprises 139,637 articles drawn from six source streams: (1) HuggingFace Salvadoran news datasets (Justinian336, 2023), contributing 85,912 articles primarily from El Mundo (diario.elmundo.sv) and El Diario de Hoy (elsalvador.com); (2) direct scrapes of additional outlets including Revista Factum, Foco STV, and the GDELT-linked Salvadoran press (17,629 articles); (3) the original article collection via sitemaps and GDELT BigQuery (8,815 articles); (4) repaired articles recovered from broken URLs via HTTP redirect-following and Wayback Machine CDX lookup (8,157 articles); (5) new outlet scrapes (640 articles); and (6) internationally-sourced articles filtered for political relevance to El Salvador (30,849 articles from Reuters, Deutsche Welle, The Guardian, Proceso.hn, Univision, and others).</w:t>
+        <w:t>The news article corpus comprises 139,637 articles drawn from six source streams: (1) HuggingFace Salvadoran news datasets (Martinez, 2023), contributing 85,912 articles primarily from El Mundo (diario.elmundo.sv) and El Diario de Hoy (elsalvador.com); (2) direct scrapes of additional outlets including Revista Factum, Foco STV, and the GDELT-linked Salvadoran press (17,629 articles); (3) the original article collection via sitemaps and GDELT BigQuery (8,815 articles); (4) repaired articles recovered from broken URLs via HTTP redirect-following and Wayback Machine CDX lookup (8,157 articles); (5) new outlet scrapes (640 articles); and (6) internationally-sourced articles filtered for political relevance to El Salvador (30,849 articles from Reuters, Deutsche Welle, The Guardian, Proceso.hn, Univision, and others).</w:t>
       </w:r>
     </w:p>
     <w:p>
@@ -4180,7 +4180,7 @@
           <w:i w:val="0"/>
           <w:sz w:val="24"/>
         </w:rPr>
-        <w:t>Several limitations deserve emphasis. First, cosine similarity measures aggregate lexical overlap rather than semantic content. Two accounts might use identical words with different tone or implication. Embedding-based similarity measures would strengthen this analysis. Second, the before/after comparison for institutional convergence is not a clean natural experiment: the leadership change coincided with a new legislative supermajority, broader political context shifts, and the post-COVID transition. Attributing convergence specifically to institutional capture requires caution. Third, we do not model audience reception. Government messaging and independent media may reach different audiences, in which case the framing divergence we document may not translate into measurable attitudinal differences among citizens.</w:t>
+        <w:t>Several limitations deserve emphasis. First, cosine similarity measures aggregate lexical overlap rather than semantic content. Two accounts might use identical words with different tone or implication. Embedding-based similarity measures would strengthen this analysis. Second, the before/after comparison for institutional convergence is not a clean natural experiment. Three changes occurred simultaneously on May 1, 2021: (a) new personnel loyal to Bukele replaced the leadership of @AsambleaSV and @FGR_SV; (b) a new Nuevas Ideas supermajority took over the legislature, shifting the institution's political agenda regardless of any coordination directive; and (c) the post-pandemic political environment and the impending Bitcoin rollout altered the broader communications landscape for all accounts. The design cannot fully disentangle personnel replacement from these concurrent shifts. One partial check is available: @Gobierno_SV and @PresidenciaSV were already under executive control before May 2021, yet they also converged toward @nayibbukele post-capture (+29% and +52%, respectively), suggesting the shift was not purely an artifact of leadership replacement in the directly captured institutions. Nevertheless, the finding should be interpreted as consistent with the capture hypothesis rather than a causal identification of it. Third, we do not model audience reception. Government messaging and independent media may reach different audiences, in which case the framing divergence we document may not translate into measurable attitudinal differences among citizens.</w:t>
       </w:r>
     </w:p>
     <w:p>
@@ -4471,7 +4471,7 @@
           <w:i w:val="0"/>
           <w:sz w:val="24"/>
         </w:rPr>
-        <w:t>Justinian336. (2023). Salvadoran news datasets [Data set]. HuggingFace. https://huggingface.co/justinian336</w:t>
+        <w:t>Martinez, J. (2023). salvadoran-news [Data set]. HuggingFace. https://huggingface.co/datasets/justinian336/salvadoran-news</w:t>
       </w:r>
     </w:p>
     <w:p>

</xml_diff>